<commit_message>
Unify document formatting and verify table font sizes
</commit_message>
<xml_diff>
--- a/quarto/_extensions/academic/academic-monochrome.docx
+++ b/quarto/_extensions/academic/academic-monochrome.docx
@@ -26,7 +26,7 @@
         <w:t xml:space="preserve">Цель работы состоит в сравнении двух способов вычисления суммы значений функции. Для достижения цели необходимо задать исходные параметры, выполнить расчёт и сопоставить результаты. Все значения используют одну систему единиц измерения.</w:t>
       </w:r>
     </w:p>
-    <w:bookmarkStart w:id="22" w:name="постановка-задачи"/>
+    <w:bookmarkStart w:name="постановка-задачи" w:id="22"/>
     <w:p>
       <w:pPr>
         <w:pStyle w:val="Heading1"/>
@@ -43,7 +43,7 @@
         <w:t xml:space="preserve">Рассматривается зависимость показателя от изменения исходного коэффициента. Анализ выполняется для конечного набора значений аргумента. Результаты сравнения характеризуют выбранную модель и не распространяются автоматически на другие условия.</w:t>
       </w:r>
     </w:p>
-    <w:bookmarkStart w:id="20" w:name="исходные-данные"/>
+    <w:bookmarkStart w:name="исходные-данные" w:id="20"/>
     <w:p>
       <w:pPr>
         <w:pStyle w:val="Heading2"/>
@@ -60,7 +60,7 @@
         <w:t xml:space="preserve">Исходные данные задаются до начала вычислений. Коэффициенты модели считаются постоянными в пределах одного расчёта. При изменении коэффициента расчёт выполняется повторно для всего набора значений аргумента.</w:t>
       </w:r>
     </w:p>
-    <w:bookmarkStart w:id="19" w:name="условия-применимости"/>
+    <w:bookmarkStart w:name="условия-применимости" w:id="19"/>
     <w:p>
       <w:pPr>
         <w:pStyle w:val="Heading3"/>
@@ -77,7 +77,7 @@
         <w:t xml:space="preserve">Метод применим при условии, что значения функции определены во всех исследуемых точках. Если условие нарушается, набор исходных данных уточняется до сравнения результатов. Погрешность округления оценивается отдельно от погрешности метода.</w:t>
       </w:r>
     </w:p>
-    <w:bookmarkStart w:id="18" w:name="проверка-параметров"/>
+    <w:bookmarkStart w:name="проверка-параметров" w:id="18"/>
     <w:p>
       <w:pPr>
         <w:pStyle w:val="Heading4"/>
@@ -97,7 +97,7 @@
     <w:bookmarkEnd w:id="18"/>
     <w:bookmarkEnd w:id="19"/>
     <w:bookmarkEnd w:id="20"/>
-    <w:bookmarkStart w:id="21" w:name="представление-результатов"/>
+    <w:bookmarkStart w:name="представление-результатов" w:id="21"/>
     <w:p>
       <w:pPr>
         <w:pStyle w:val="Heading2"/>
@@ -186,12 +186,12 @@
     <w:bookmarkEnd w:id="21"/>
     <w:bookmarkEnd w:id="22"/>
     <w:sectPr>
-      <w:footerReference r:id="rId9" w:type="default"/>
+      <w:footerReference w:type="default" r:id="rId9"/>
       <w:footnotePr>
         <w:numRestart w:val="eachSect"/>
       </w:footnotePr>
-      <w:pgSz w:h="16838" w:w="11906"/>
-      <w:pgMar w:bottom="1474" w:footer="1134" w:left="1417" w:right="567" w:top="1134"/>
+      <w:pgSz w:w="11906" w:h="16838"/>
+      <w:pgMar w:top="1134" w:right="567" w:bottom="1474" w:left="1417" w:footer="1134"/>
     </w:sectPr>
   </w:body>
 </w:document>
@@ -250,10 +250,10 @@
       <w:lvlText w:val="%1"/>
       <w:lvlJc w:val="left"/>
       <w:pPr>
-        <w:ind w:firstLine="397" w:left="0"/>
+        <w:ind w:left="0" w:firstLine="397"/>
       </w:pPr>
       <w:rPr>
-        <w:rFonts w:ascii="Times New Roman" w:cs="Times New Roman" w:eastAsia="Times New Roman" w:hAnsi="Times New Roman"/>
+        <w:rFonts w:ascii="Times New Roman" w:hAnsi="Times New Roman" w:eastAsia="Times New Roman" w:cs="Times New Roman"/>
         <w:color w:val="000000"/>
         <w:sz w:val="28"/>
         <w:szCs w:val="28"/>
@@ -268,10 +268,10 @@
       <w:lvlText w:val="%1.%2"/>
       <w:lvlJc w:val="left"/>
       <w:pPr>
-        <w:ind w:firstLine="397" w:left="0"/>
+        <w:ind w:left="0" w:firstLine="397"/>
       </w:pPr>
       <w:rPr>
-        <w:rFonts w:ascii="Times New Roman" w:cs="Times New Roman" w:eastAsia="Times New Roman" w:hAnsi="Times New Roman"/>
+        <w:rFonts w:ascii="Times New Roman" w:hAnsi="Times New Roman" w:eastAsia="Times New Roman" w:cs="Times New Roman"/>
         <w:color w:val="000000"/>
         <w:sz w:val="28"/>
         <w:szCs w:val="28"/>
@@ -286,10 +286,10 @@
       <w:lvlText w:val="%1.%2.%3"/>
       <w:lvlJc w:val="left"/>
       <w:pPr>
-        <w:ind w:firstLine="397" w:left="0"/>
+        <w:ind w:left="0" w:firstLine="397"/>
       </w:pPr>
       <w:rPr>
-        <w:rFonts w:ascii="Times New Roman" w:cs="Times New Roman" w:eastAsia="Times New Roman" w:hAnsi="Times New Roman"/>
+        <w:rFonts w:ascii="Times New Roman" w:hAnsi="Times New Roman" w:eastAsia="Times New Roman" w:cs="Times New Roman"/>
         <w:color w:val="000000"/>
         <w:sz w:val="28"/>
         <w:szCs w:val="28"/>
@@ -304,10 +304,10 @@
       <w:lvlText w:val="%1.%2.%3.%4"/>
       <w:lvlJc w:val="left"/>
       <w:pPr>
-        <w:ind w:firstLine="397" w:left="0"/>
+        <w:ind w:left="0" w:firstLine="397"/>
       </w:pPr>
       <w:rPr>
-        <w:rFonts w:ascii="Times New Roman" w:cs="Times New Roman" w:eastAsia="Times New Roman" w:hAnsi="Times New Roman"/>
+        <w:rFonts w:ascii="Times New Roman" w:hAnsi="Times New Roman" w:eastAsia="Times New Roman" w:cs="Times New Roman"/>
         <w:color w:val="000000"/>
         <w:sz w:val="28"/>
         <w:szCs w:val="28"/>
@@ -405,119 +405,119 @@
   <w:docDefaults>
     <w:rPrDefault>
       <w:rPr>
-        <w:rFonts w:ascii="Times New Roman" w:cs="Times New Roman" w:eastAsia="Times New Roman" w:hAnsi="Times New Roman"/>
+        <w:rFonts w:ascii="Times New Roman" w:hAnsi="Times New Roman" w:eastAsia="Times New Roman" w:cs="Times New Roman"/>
         <w:color w:val="000000"/>
         <w:sz w:val="28"/>
         <w:szCs w:val="28"/>
-        <w:lang w:bidi="ar-SA" w:eastAsia="zh-CN" w:val="ru"/>
+        <w:lang w:val="ru-RU" w:eastAsia="zh-CN" w:bidi="ar-SA"/>
       </w:rPr>
     </w:rPrDefault>
     <w:pPrDefault>
       <w:pPr>
-        <w:spacing w:after="0" w:before="0" w:line="240" w:lineRule="auto"/>
+        <w:spacing w:before="0" w:after="0" w:line="240" w:lineRule="auto"/>
         <w:ind w:firstLine="397"/>
       </w:pPr>
     </w:pPrDefault>
   </w:docDefaults>
-  <w:latentStyles w:count="276" w:defLockedState="0" w:defQFormat="0" w:defSemiHidden="0" w:defUIPriority="0" w:defUnhideWhenUsed="0"/>
-  <w:style w:default="1" w:styleId="Normal" w:type="paragraph">
+  <w:latentStyles w:defLockedState="0" w:defUIPriority="0" w:defSemiHidden="0" w:defUnhideWhenUsed="0" w:defQFormat="0" w:count="276"/>
+  <w:style w:type="paragraph" w:styleId="Normal" w:default="1">
     <w:name w:val="Normal"/>
     <w:qFormat/>
     <w:pPr>
-      <w:keepNext w:val="0"/>
-      <w:keepLines w:val="0"/>
-      <w:pageBreakBefore w:val="0"/>
-      <w:widowControl/>
-      <w:spacing w:after="0" w:before="0" w:line="240" w:lineRule="auto"/>
-      <w:ind w:firstLine="397" w:left="0" w:right="0"/>
+      <w:keepNext w:val="false"/>
+      <w:keepLines w:val="false"/>
+      <w:pageBreakBefore w:val="false"/>
+      <w:widowControl w:val="true"/>
+      <w:spacing w:before="0" w:after="0" w:line="240" w:lineRule="auto"/>
+      <w:ind w:left="0" w:right="0" w:firstLine="397"/>
       <w:jc w:val="both"/>
     </w:pPr>
     <w:rPr>
-      <w:rFonts w:ascii="Times New Roman" w:cs="Times New Roman" w:eastAsia="Times New Roman" w:hAnsi="Times New Roman"/>
-      <w:b w:val="0"/>
-      <w:i w:val="0"/>
-      <w:caps w:val="0"/>
-      <w:color w:val="000000"/>
-      <w:sz w:val="28"/>
-      <w:szCs w:val="28"/>
-      <w:lang w:val="ru-RU"/>
-    </w:rPr>
-  </w:style>
-  <w:style w:styleId="BodyText" w:type="paragraph">
+      <w:rFonts w:ascii="Times New Roman" w:hAnsi="Times New Roman" w:eastAsia="Times New Roman" w:cs="Times New Roman"/>
+      <w:b w:val="false"/>
+      <w:i w:val="false"/>
+      <w:caps w:val="false"/>
+      <w:color w:val="000000"/>
+      <w:sz w:val="28"/>
+      <w:szCs w:val="28"/>
+      <w:lang w:val="ru-RU"/>
+    </w:rPr>
+  </w:style>
+  <w:style w:type="paragraph" w:styleId="BodyText">
     <w:name w:val="Body Text"/>
     <w:basedOn w:val="Normal"/>
     <w:link w:val="BodyTextChar"/>
     <w:qFormat/>
     <w:pPr>
-      <w:keepNext w:val="0"/>
-      <w:keepLines w:val="0"/>
-      <w:pageBreakBefore w:val="0"/>
-      <w:widowControl/>
-      <w:spacing w:after="0" w:before="0" w:line="240" w:lineRule="auto"/>
-      <w:ind w:firstLine="397" w:left="0" w:right="0"/>
+      <w:keepNext w:val="false"/>
+      <w:keepLines w:val="false"/>
+      <w:pageBreakBefore w:val="false"/>
+      <w:widowControl w:val="true"/>
+      <w:spacing w:before="0" w:after="0" w:line="240" w:lineRule="auto"/>
+      <w:ind w:left="0" w:right="0" w:firstLine="397"/>
       <w:jc w:val="both"/>
     </w:pPr>
     <w:rPr>
-      <w:rFonts w:ascii="Times New Roman" w:cs="Times New Roman" w:eastAsia="Times New Roman" w:hAnsi="Times New Roman"/>
-      <w:b w:val="0"/>
-      <w:i w:val="0"/>
-      <w:caps w:val="0"/>
-      <w:color w:val="000000"/>
-      <w:sz w:val="28"/>
-      <w:szCs w:val="28"/>
-      <w:lang w:val="ru-RU"/>
-    </w:rPr>
-  </w:style>
-  <w:style w:customStyle="1" w:styleId="FirstParagraph" w:type="paragraph">
+      <w:rFonts w:ascii="Times New Roman" w:hAnsi="Times New Roman" w:eastAsia="Times New Roman" w:cs="Times New Roman"/>
+      <w:b w:val="false"/>
+      <w:i w:val="false"/>
+      <w:caps w:val="false"/>
+      <w:color w:val="000000"/>
+      <w:sz w:val="28"/>
+      <w:szCs w:val="28"/>
+      <w:lang w:val="ru-RU"/>
+    </w:rPr>
+  </w:style>
+  <w:style w:type="paragraph" w:styleId="FirstParagraph" w:customStyle="1">
     <w:name w:val="First Paragraph"/>
     <w:basedOn w:val="Normal"/>
     <w:next w:val="BodyText"/>
     <w:qFormat/>
     <w:pPr>
-      <w:keepNext w:val="0"/>
-      <w:keepLines w:val="0"/>
-      <w:pageBreakBefore w:val="0"/>
-      <w:widowControl/>
-      <w:spacing w:after="0" w:before="0" w:line="240" w:lineRule="auto"/>
-      <w:ind w:firstLine="397" w:left="0" w:right="0"/>
+      <w:keepNext w:val="false"/>
+      <w:keepLines w:val="false"/>
+      <w:pageBreakBefore w:val="false"/>
+      <w:widowControl w:val="true"/>
+      <w:spacing w:before="0" w:after="0" w:line="240" w:lineRule="auto"/>
+      <w:ind w:left="0" w:right="0" w:firstLine="397"/>
       <w:jc w:val="both"/>
     </w:pPr>
     <w:rPr>
-      <w:rFonts w:ascii="Times New Roman" w:cs="Times New Roman" w:eastAsia="Times New Roman" w:hAnsi="Times New Roman"/>
-      <w:b w:val="0"/>
-      <w:i w:val="0"/>
-      <w:caps w:val="0"/>
-      <w:color w:val="000000"/>
-      <w:sz w:val="28"/>
-      <w:szCs w:val="28"/>
-      <w:lang w:val="ru-RU"/>
-    </w:rPr>
-  </w:style>
-  <w:style w:customStyle="1" w:styleId="Compact" w:type="paragraph">
+      <w:rFonts w:ascii="Times New Roman" w:hAnsi="Times New Roman" w:eastAsia="Times New Roman" w:cs="Times New Roman"/>
+      <w:b w:val="false"/>
+      <w:i w:val="false"/>
+      <w:caps w:val="false"/>
+      <w:color w:val="000000"/>
+      <w:sz w:val="28"/>
+      <w:szCs w:val="28"/>
+      <w:lang w:val="ru-RU"/>
+    </w:rPr>
+  </w:style>
+  <w:style w:type="paragraph" w:styleId="Compact" w:customStyle="1">
     <w:name w:val="Compact"/>
     <w:basedOn w:val="Normal"/>
     <w:qFormat/>
     <w:pPr>
-      <w:keepNext w:val="0"/>
-      <w:keepLines w:val="0"/>
-      <w:pageBreakBefore w:val="0"/>
-      <w:widowControl/>
-      <w:spacing w:after="0" w:before="0" w:line="240" w:lineRule="auto"/>
-      <w:ind w:firstLine="0" w:left="0" w:right="0"/>
+      <w:keepNext w:val="false"/>
+      <w:keepLines w:val="false"/>
+      <w:pageBreakBefore w:val="false"/>
+      <w:widowControl w:val="true"/>
+      <w:spacing w:before="0" w:after="0" w:line="240" w:lineRule="auto"/>
+      <w:ind w:left="0" w:right="0" w:firstLine="0"/>
       <w:jc w:val="left"/>
     </w:pPr>
     <w:rPr>
-      <w:rFonts w:ascii="Times New Roman" w:cs="Times New Roman" w:eastAsia="Times New Roman" w:hAnsi="Times New Roman"/>
-      <w:b w:val="0"/>
-      <w:i w:val="0"/>
-      <w:caps w:val="0"/>
-      <w:color w:val="000000"/>
-      <w:sz w:val="28"/>
-      <w:szCs w:val="28"/>
-      <w:lang w:val="ru-RU"/>
-    </w:rPr>
-  </w:style>
-  <w:style w:styleId="Title" w:type="paragraph">
+      <w:rFonts w:ascii="Times New Roman" w:hAnsi="Times New Roman" w:eastAsia="Times New Roman" w:cs="Times New Roman"/>
+      <w:b w:val="false"/>
+      <w:i w:val="false"/>
+      <w:caps w:val="false"/>
+      <w:color w:val="000000"/>
+      <w:sz w:val="28"/>
+      <w:szCs w:val="28"/>
+      <w:lang w:val="ru-RU"/>
+    </w:rPr>
+  </w:style>
+  <w:style w:type="paragraph" w:styleId="Title">
     <w:name w:val="Title"/>
     <w:basedOn w:val="Normal"/>
     <w:next w:val="BodyText"/>
@@ -530,32 +530,32 @@
       <w:numPr>
         <w:numId w:val="0"/>
       </w:numPr>
-      <w:spacing w:after="400" w:before="0" w:line="240" w:lineRule="auto"/>
+      <w:spacing w:before="0" w:after="400" w:line="240" w:lineRule="auto"/>
       <w:ind w:firstLine="0"/>
       <w:contextualSpacing/>
       <w:jc w:val="center"/>
     </w:pPr>
     <w:rPr>
-      <w:rFonts w:ascii="Times New Roman" w:cstheme="majorBidi" w:hAnsi="Times New Roman"/>
+      <w:rFonts w:ascii="Times New Roman" w:hAnsi="Times New Roman" w:cstheme="majorBidi"/>
       <w:b/>
       <w:color w:val="000000"/>
       <w:sz w:val="32"/>
       <w:szCs w:val="56"/>
     </w:rPr>
   </w:style>
-  <w:style w:customStyle="1" w:styleId="TitleChar" w:type="character">
+  <w:style w:type="character" w:styleId="TitleChar" w:customStyle="1">
     <w:name w:val="Title Char"/>
     <w:basedOn w:val="DefaultParagraphFont"/>
     <w:link w:val="Title"/>
     <w:uiPriority w:val="10"/>
     <w:rsid w:val="00A10FD9"/>
     <w:rPr>
-      <w:rFonts w:asciiTheme="majorHAnsi" w:cstheme="majorBidi" w:eastAsiaTheme="majorEastAsia" w:hAnsiTheme="majorHAnsi"/>
+      <w:rFonts w:asciiTheme="majorHAnsi" w:hAnsiTheme="majorHAnsi" w:eastAsiaTheme="majorEastAsia" w:cstheme="majorBidi"/>
       <w:sz w:val="56"/>
       <w:szCs w:val="56"/>
     </w:rPr>
   </w:style>
-  <w:style w:styleId="Subtitle" w:type="paragraph">
+  <w:style w:type="paragraph" w:styleId="Subtitle">
     <w:name w:val="Subtitle"/>
     <w:basedOn w:val="Title"/>
     <w:next w:val="BodyText"/>
@@ -569,28 +569,28 @@
       </w:numPr>
     </w:pPr>
     <w:rPr>
-      <w:rFonts w:ascii="Times New Roman" w:cstheme="majorBidi" w:hAnsi="Times New Roman"/>
+      <w:rFonts w:ascii="Times New Roman" w:hAnsi="Times New Roman" w:cstheme="majorBidi"/>
       <w:color w:val="000000"/>
       <w:spacing w:val="15"/>
       <w:sz w:val="24"/>
       <w:szCs w:val="28"/>
     </w:rPr>
   </w:style>
-  <w:style w:customStyle="1" w:styleId="SubtitleChar" w:type="character">
+  <w:style w:type="character" w:styleId="SubtitleChar" w:customStyle="1">
     <w:name w:val="Subtitle Char"/>
     <w:basedOn w:val="DefaultParagraphFont"/>
     <w:link w:val="Subtitle"/>
     <w:uiPriority w:val="11"/>
     <w:rsid w:val="00A10FD9"/>
     <w:rPr>
-      <w:rFonts w:cstheme="majorBidi" w:eastAsiaTheme="majorEastAsia"/>
-      <w:color w:themeColor="text1" w:themeTint="A6" w:val="595959"/>
+      <w:rFonts w:eastAsiaTheme="majorEastAsia" w:cstheme="majorBidi"/>
+      <w:color w:val="595959" w:themeColor="text1" w:themeTint="A6"/>
       <w:spacing w:val="15"/>
       <w:sz w:val="28"/>
       <w:szCs w:val="28"/>
     </w:rPr>
   </w:style>
-  <w:style w:customStyle="1" w:styleId="Author" w:type="paragraph">
+  <w:style w:type="paragraph" w:styleId="Author" w:customStyle="1">
     <w:name w:val="Author"/>
     <w:basedOn w:val="Title"/>
     <w:next w:val="BodyText"/>
@@ -606,7 +606,7 @@
       <w:szCs w:val="24"/>
     </w:rPr>
   </w:style>
-  <w:style w:styleId="Date" w:type="paragraph">
+  <w:style w:type="paragraph" w:styleId="Date">
     <w:name w:val="Date"/>
     <w:basedOn w:val="Title"/>
     <w:next w:val="BodyText"/>
@@ -622,7 +622,7 @@
       <w:szCs w:val="24"/>
     </w:rPr>
   </w:style>
-  <w:style w:customStyle="1" w:styleId="AbstractTitle" w:type="paragraph">
+  <w:style w:type="paragraph" w:styleId="AbstractTitle" w:customStyle="1">
     <w:name w:val="Abstract Title"/>
     <w:basedOn w:val="Normal"/>
     <w:next w:val="Abstract"/>
@@ -630,7 +630,7 @@
     <w:pPr>
       <w:keepNext/>
       <w:keepLines/>
-      <w:spacing w:after="0" w:before="300"/>
+      <w:spacing w:before="300" w:after="0"/>
       <w:jc w:val="center"/>
     </w:pPr>
     <w:rPr>
@@ -641,7 +641,7 @@
       <w:szCs w:val="20"/>
     </w:rPr>
   </w:style>
-  <w:style w:customStyle="1" w:styleId="Abstract" w:type="paragraph">
+  <w:style w:type="paragraph" w:styleId="Abstract" w:customStyle="1">
     <w:name w:val="Abstract"/>
     <w:basedOn w:val="Normal"/>
     <w:next w:val="BodyText"/>
@@ -649,7 +649,7 @@
     <w:pPr>
       <w:keepNext/>
       <w:keepLines/>
-      <w:spacing w:after="300" w:before="100"/>
+      <w:spacing w:before="100" w:after="300"/>
     </w:pPr>
     <w:rPr>
       <w:rFonts w:ascii="Times New Roman" w:hAnsi="Times New Roman"/>
@@ -658,32 +658,32 @@
       <w:szCs w:val="20"/>
     </w:rPr>
   </w:style>
-  <w:style w:styleId="Bibliography" w:type="paragraph">
+  <w:style w:type="paragraph" w:styleId="Bibliography">
     <w:name w:val="Bibliography"/>
     <w:basedOn w:val="Normal"/>
     <w:next w:val="Bibliography"/>
     <w:qFormat/>
     <w:pPr>
-      <w:keepNext w:val="0"/>
-      <w:keepLines w:val="0"/>
-      <w:pageBreakBefore w:val="0"/>
-      <w:widowControl/>
-      <w:spacing w:after="0" w:before="0" w:line="240" w:lineRule="auto"/>
-      <w:ind w:firstLine="397" w:left="0" w:right="0"/>
+      <w:keepNext w:val="false"/>
+      <w:keepLines w:val="false"/>
+      <w:pageBreakBefore w:val="false"/>
+      <w:widowControl w:val="true"/>
+      <w:spacing w:before="0" w:after="0" w:line="240" w:lineRule="auto"/>
+      <w:ind w:left="0" w:right="0" w:firstLine="397"/>
       <w:jc w:val="both"/>
     </w:pPr>
     <w:rPr>
-      <w:rFonts w:ascii="Times New Roman" w:cs="Times New Roman" w:eastAsia="Times New Roman" w:hAnsi="Times New Roman"/>
-      <w:b w:val="0"/>
-      <w:i w:val="0"/>
-      <w:caps w:val="0"/>
-      <w:color w:val="000000"/>
-      <w:sz w:val="28"/>
-      <w:szCs w:val="28"/>
-      <w:lang w:val="ru-RU"/>
-    </w:rPr>
-  </w:style>
-  <w:style w:styleId="Heading1" w:type="paragraph">
+      <w:rFonts w:ascii="Times New Roman" w:hAnsi="Times New Roman" w:eastAsia="Times New Roman" w:cs="Times New Roman"/>
+      <w:b w:val="false"/>
+      <w:i w:val="false"/>
+      <w:caps w:val="false"/>
+      <w:color w:val="000000"/>
+      <w:sz w:val="28"/>
+      <w:szCs w:val="28"/>
+      <w:lang w:val="ru-RU"/>
+    </w:rPr>
+  </w:style>
+  <w:style w:type="paragraph" w:styleId="Heading1">
     <w:name w:val="heading 1"/>
     <w:basedOn w:val="Normal"/>
     <w:next w:val="BodyText"/>
@@ -692,32 +692,32 @@
     <w:qFormat/>
     <w:rsid w:val="00A10FD9"/>
     <w:pPr>
-      <w:keepNext/>
-      <w:keepLines/>
-      <w:pageBreakBefore w:val="0"/>
-      <w:widowControl/>
+      <w:keepNext w:val="true"/>
+      <w:keepLines w:val="true"/>
+      <w:pageBreakBefore w:val="false"/>
+      <w:widowControl w:val="true"/>
       <w:numPr>
         <w:ilvl w:val="0"/>
         <w:numId w:val="100"/>
       </w:numPr>
-      <w:suppressAutoHyphens w:val="1"/>
-      <w:spacing w:after="280" w:before="280" w:line="240" w:lineRule="auto"/>
-      <w:ind w:firstLine="397" w:left="0" w:right="0"/>
+      <w:suppressAutoHyphens w:val="true"/>
+      <w:spacing w:before="280" w:after="280" w:line="240" w:lineRule="auto"/>
+      <w:ind w:left="0" w:right="0" w:firstLine="397"/>
       <w:jc w:val="left"/>
       <w:outlineLvl w:val="0"/>
     </w:pPr>
     <w:rPr>
-      <w:rFonts w:ascii="Times New Roman" w:cs="Times New Roman" w:eastAsia="Times New Roman" w:hAnsi="Times New Roman"/>
-      <w:b/>
-      <w:i w:val="0"/>
-      <w:caps/>
-      <w:color w:val="000000"/>
-      <w:sz w:val="28"/>
-      <w:szCs w:val="28"/>
-      <w:lang w:val="ru-RU"/>
-    </w:rPr>
-  </w:style>
-  <w:style w:styleId="Heading2" w:type="paragraph">
+      <w:rFonts w:ascii="Times New Roman" w:hAnsi="Times New Roman" w:eastAsia="Times New Roman" w:cs="Times New Roman"/>
+      <w:b w:val="true"/>
+      <w:i w:val="false"/>
+      <w:caps w:val="true"/>
+      <w:color w:val="000000"/>
+      <w:sz w:val="28"/>
+      <w:szCs w:val="28"/>
+      <w:lang w:val="ru-RU"/>
+    </w:rPr>
+  </w:style>
+  <w:style w:type="paragraph" w:styleId="Heading2">
     <w:name w:val="heading 2"/>
     <w:basedOn w:val="Normal"/>
     <w:next w:val="BodyText"/>
@@ -728,32 +728,32 @@
     <w:qFormat/>
     <w:rsid w:val="00A10FD9"/>
     <w:pPr>
-      <w:keepNext/>
-      <w:keepLines/>
-      <w:pageBreakBefore w:val="0"/>
-      <w:widowControl/>
+      <w:keepNext w:val="true"/>
+      <w:keepLines w:val="true"/>
+      <w:pageBreakBefore w:val="false"/>
+      <w:widowControl w:val="true"/>
       <w:numPr>
         <w:ilvl w:val="1"/>
         <w:numId w:val="100"/>
       </w:numPr>
-      <w:suppressAutoHyphens w:val="1"/>
-      <w:spacing w:after="140" w:before="280" w:line="240" w:lineRule="auto"/>
-      <w:ind w:firstLine="397" w:left="0" w:right="0"/>
+      <w:suppressAutoHyphens w:val="true"/>
+      <w:spacing w:before="280" w:after="140" w:line="240" w:lineRule="auto"/>
+      <w:ind w:left="0" w:right="0" w:firstLine="397"/>
       <w:jc w:val="left"/>
       <w:outlineLvl w:val="1"/>
     </w:pPr>
     <w:rPr>
-      <w:rFonts w:ascii="Times New Roman" w:cs="Times New Roman" w:eastAsia="Times New Roman" w:hAnsi="Times New Roman"/>
-      <w:b/>
-      <w:i w:val="0"/>
-      <w:caps w:val="0"/>
-      <w:color w:val="000000"/>
-      <w:sz w:val="28"/>
-      <w:szCs w:val="28"/>
-      <w:lang w:val="ru-RU"/>
-    </w:rPr>
-  </w:style>
-  <w:style w:styleId="Heading3" w:type="paragraph">
+      <w:rFonts w:ascii="Times New Roman" w:hAnsi="Times New Roman" w:eastAsia="Times New Roman" w:cs="Times New Roman"/>
+      <w:b w:val="true"/>
+      <w:i w:val="false"/>
+      <w:caps w:val="false"/>
+      <w:color w:val="000000"/>
+      <w:sz w:val="28"/>
+      <w:szCs w:val="28"/>
+      <w:lang w:val="ru-RU"/>
+    </w:rPr>
+  </w:style>
+  <w:style w:type="paragraph" w:styleId="Heading3">
     <w:name w:val="heading 3"/>
     <w:basedOn w:val="Normal"/>
     <w:next w:val="BodyText"/>
@@ -764,32 +764,32 @@
     <w:qFormat/>
     <w:rsid w:val="00A10FD9"/>
     <w:pPr>
-      <w:keepNext/>
-      <w:keepLines/>
-      <w:pageBreakBefore w:val="0"/>
-      <w:widowControl/>
+      <w:keepNext w:val="true"/>
+      <w:keepLines w:val="true"/>
+      <w:pageBreakBefore w:val="false"/>
+      <w:widowControl w:val="true"/>
       <w:numPr>
         <w:ilvl w:val="2"/>
         <w:numId w:val="100"/>
       </w:numPr>
-      <w:suppressAutoHyphens w:val="1"/>
-      <w:spacing w:after="140" w:before="140" w:line="240" w:lineRule="auto"/>
-      <w:ind w:firstLine="397" w:left="0" w:right="0"/>
+      <w:suppressAutoHyphens w:val="true"/>
+      <w:spacing w:before="140" w:after="140" w:line="240" w:lineRule="auto"/>
+      <w:ind w:left="0" w:right="0" w:firstLine="397"/>
       <w:jc w:val="left"/>
       <w:outlineLvl w:val="2"/>
     </w:pPr>
     <w:rPr>
-      <w:rFonts w:ascii="Times New Roman" w:cs="Times New Roman" w:eastAsia="Times New Roman" w:hAnsi="Times New Roman"/>
-      <w:b w:val="0"/>
-      <w:i/>
-      <w:caps w:val="0"/>
-      <w:color w:val="000000"/>
-      <w:sz w:val="28"/>
-      <w:szCs w:val="28"/>
-      <w:lang w:val="ru-RU"/>
-    </w:rPr>
-  </w:style>
-  <w:style w:styleId="Heading4" w:type="paragraph">
+      <w:rFonts w:ascii="Times New Roman" w:hAnsi="Times New Roman" w:eastAsia="Times New Roman" w:cs="Times New Roman"/>
+      <w:b w:val="false"/>
+      <w:i w:val="true"/>
+      <w:caps w:val="false"/>
+      <w:color w:val="000000"/>
+      <w:sz w:val="28"/>
+      <w:szCs w:val="28"/>
+      <w:lang w:val="ru-RU"/>
+    </w:rPr>
+  </w:style>
+  <w:style w:type="paragraph" w:styleId="Heading4">
     <w:name w:val="heading 4"/>
     <w:basedOn w:val="Normal"/>
     <w:next w:val="BodyText"/>
@@ -800,33 +800,33 @@
     <w:qFormat/>
     <w:rsid w:val="00A10FD9"/>
     <w:pPr>
-      <w:keepNext/>
-      <w:keepLines/>
-      <w:pageBreakBefore w:val="0"/>
-      <w:widowControl/>
+      <w:keepNext w:val="true"/>
+      <w:keepLines w:val="true"/>
+      <w:pageBreakBefore w:val="false"/>
+      <w:widowControl w:val="true"/>
       <w:numPr>
         <w:ilvl w:val="3"/>
         <w:numId w:val="100"/>
       </w:numPr>
-      <w:suppressAutoHyphens w:val="1"/>
-      <w:spacing w:after="140" w:before="140" w:line="240" w:lineRule="auto"/>
-      <w:ind w:firstLine="397" w:left="0" w:right="0"/>
+      <w:suppressAutoHyphens w:val="true"/>
+      <w:spacing w:before="140" w:after="140" w:line="240" w:lineRule="auto"/>
+      <w:ind w:left="0" w:right="0" w:firstLine="397"/>
       <w:jc w:val="left"/>
       <w:outlineLvl w:val="3"/>
     </w:pPr>
     <w:rPr>
-      <w:rFonts w:ascii="Times New Roman" w:cs="Times New Roman" w:eastAsia="Times New Roman" w:hAnsi="Times New Roman"/>
-      <w:b w:val="0"/>
-      <w:i/>
+      <w:rFonts w:ascii="Times New Roman" w:hAnsi="Times New Roman" w:eastAsia="Times New Roman" w:cs="Times New Roman"/>
+      <w:b w:val="false"/>
+      <w:i w:val="true"/>
       <w:iCs/>
-      <w:caps w:val="0"/>
-      <w:color w:val="000000"/>
-      <w:sz w:val="28"/>
-      <w:szCs w:val="28"/>
-      <w:lang w:val="ru-RU"/>
-    </w:rPr>
-  </w:style>
-  <w:style w:styleId="Heading5" w:type="paragraph">
+      <w:caps w:val="false"/>
+      <w:color w:val="000000"/>
+      <w:sz w:val="28"/>
+      <w:szCs w:val="28"/>
+      <w:lang w:val="ru-RU"/>
+    </w:rPr>
+  </w:style>
+  <w:style w:type="paragraph" w:styleId="Heading5">
     <w:name w:val="heading 5"/>
     <w:basedOn w:val="Normal"/>
     <w:next w:val="BodyText"/>
@@ -839,16 +839,16 @@
     <w:pPr>
       <w:keepNext/>
       <w:keepLines/>
-      <w:spacing w:after="40" w:before="80"/>
+      <w:spacing w:before="80" w:after="40"/>
       <w:outlineLvl w:val="4"/>
     </w:pPr>
     <w:rPr>
-      <w:rFonts w:ascii="Times New Roman" w:cstheme="majorBidi" w:hAnsi="Times New Roman"/>
+      <w:rFonts w:ascii="Times New Roman" w:hAnsi="Times New Roman" w:cstheme="majorBidi"/>
       <w:color w:val="000000"/>
       <w:sz w:val="24"/>
     </w:rPr>
   </w:style>
-  <w:style w:styleId="Heading6" w:type="paragraph">
+  <w:style w:type="paragraph" w:styleId="Heading6">
     <w:name w:val="heading 6"/>
     <w:basedOn w:val="Normal"/>
     <w:next w:val="BodyText"/>
@@ -861,18 +861,18 @@
     <w:pPr>
       <w:keepNext/>
       <w:keepLines/>
-      <w:spacing w:after="0" w:before="40"/>
+      <w:spacing w:before="40" w:after="0"/>
       <w:outlineLvl w:val="5"/>
     </w:pPr>
     <w:rPr>
-      <w:rFonts w:ascii="Times New Roman" w:cstheme="majorBidi" w:hAnsi="Times New Roman"/>
+      <w:rFonts w:ascii="Times New Roman" w:hAnsi="Times New Roman" w:cstheme="majorBidi"/>
       <w:i/>
       <w:iCs/>
       <w:color w:val="000000"/>
       <w:sz w:val="24"/>
     </w:rPr>
   </w:style>
-  <w:style w:styleId="Heading7" w:type="paragraph">
+  <w:style w:type="paragraph" w:styleId="Heading7">
     <w:name w:val="heading 7"/>
     <w:basedOn w:val="Normal"/>
     <w:next w:val="BodyText"/>
@@ -885,16 +885,16 @@
     <w:pPr>
       <w:keepNext/>
       <w:keepLines/>
-      <w:spacing w:after="0" w:before="40"/>
+      <w:spacing w:before="40" w:after="0"/>
       <w:outlineLvl w:val="6"/>
     </w:pPr>
     <w:rPr>
-      <w:rFonts w:ascii="Times New Roman" w:cstheme="majorBidi" w:hAnsi="Times New Roman"/>
+      <w:rFonts w:ascii="Times New Roman" w:hAnsi="Times New Roman" w:cstheme="majorBidi"/>
       <w:color w:val="000000"/>
       <w:sz w:val="24"/>
     </w:rPr>
   </w:style>
-  <w:style w:styleId="Heading8" w:type="paragraph">
+  <w:style w:type="paragraph" w:styleId="Heading8">
     <w:name w:val="heading 8"/>
     <w:basedOn w:val="Normal"/>
     <w:next w:val="BodyText"/>
@@ -911,14 +911,14 @@
       <w:outlineLvl w:val="7"/>
     </w:pPr>
     <w:rPr>
-      <w:rFonts w:ascii="Times New Roman" w:cstheme="majorBidi" w:hAnsi="Times New Roman"/>
+      <w:rFonts w:ascii="Times New Roman" w:hAnsi="Times New Roman" w:cstheme="majorBidi"/>
       <w:i/>
       <w:iCs/>
       <w:color w:val="000000"/>
       <w:sz w:val="24"/>
     </w:rPr>
   </w:style>
-  <w:style w:styleId="Heading9" w:type="paragraph">
+  <w:style w:type="paragraph" w:styleId="Heading9">
     <w:name w:val="heading 9"/>
     <w:basedOn w:val="Normal"/>
     <w:next w:val="BodyText"/>
@@ -935,26 +935,26 @@
       <w:outlineLvl w:val="8"/>
     </w:pPr>
     <w:rPr>
-      <w:rFonts w:ascii="Times New Roman" w:cstheme="majorBidi" w:hAnsi="Times New Roman"/>
+      <w:rFonts w:ascii="Times New Roman" w:hAnsi="Times New Roman" w:cstheme="majorBidi"/>
       <w:color w:val="000000"/>
       <w:sz w:val="24"/>
     </w:rPr>
   </w:style>
-  <w:style w:customStyle="1" w:styleId="Heading1Char" w:type="character">
+  <w:style w:type="character" w:styleId="Heading1Char" w:customStyle="1">
     <w:name w:val="Heading 1 Char"/>
     <w:basedOn w:val="DefaultParagraphFont"/>
     <w:link w:val="Heading1"/>
     <w:uiPriority w:val="9"/>
     <w:rsid w:val="00A10FD9"/>
     <w:rPr>
-      <w:rFonts w:ascii="Times New Roman" w:cs="Times New Roman" w:eastAsia="Times New Roman" w:hAnsi="Times New Roman"/>
-      <w:color w:themeColor="accent1" w:themeShade="BF" w:val="000000"/>
-      <w:sz w:val="28"/>
-      <w:szCs w:val="28"/>
-      <w:lang w:val="ru-RU"/>
-    </w:rPr>
-  </w:style>
-  <w:style w:customStyle="1" w:styleId="Heading2Char" w:type="character">
+      <w:rFonts w:ascii="Times New Roman" w:hAnsi="Times New Roman" w:eastAsia="Times New Roman" w:cs="Times New Roman"/>
+      <w:color w:val="000000" w:themeColor="accent1" w:themeShade="BF"/>
+      <w:sz w:val="28"/>
+      <w:szCs w:val="28"/>
+      <w:lang w:val="ru-RU"/>
+    </w:rPr>
+  </w:style>
+  <w:style w:type="character" w:styleId="Heading2Char" w:customStyle="1">
     <w:name w:val="Heading 2 Char"/>
     <w:basedOn w:val="DefaultParagraphFont"/>
     <w:link w:val="Heading2"/>
@@ -962,14 +962,14 @@
     <w:semiHidden/>
     <w:rsid w:val="00A10FD9"/>
     <w:rPr>
-      <w:rFonts w:ascii="Times New Roman" w:cs="Times New Roman" w:eastAsia="Times New Roman" w:hAnsi="Times New Roman"/>
-      <w:color w:themeColor="accent1" w:themeShade="BF" w:val="000000"/>
-      <w:sz w:val="28"/>
-      <w:szCs w:val="28"/>
-      <w:lang w:val="ru-RU"/>
-    </w:rPr>
-  </w:style>
-  <w:style w:customStyle="1" w:styleId="Heading3Char" w:type="character">
+      <w:rFonts w:ascii="Times New Roman" w:hAnsi="Times New Roman" w:eastAsia="Times New Roman" w:cs="Times New Roman"/>
+      <w:color w:val="000000" w:themeColor="accent1" w:themeShade="BF"/>
+      <w:sz w:val="28"/>
+      <w:szCs w:val="28"/>
+      <w:lang w:val="ru-RU"/>
+    </w:rPr>
+  </w:style>
+  <w:style w:type="character" w:styleId="Heading3Char" w:customStyle="1">
     <w:name w:val="Heading 3 Char"/>
     <w:basedOn w:val="DefaultParagraphFont"/>
     <w:link w:val="Heading3"/>
@@ -977,14 +977,14 @@
     <w:semiHidden/>
     <w:rsid w:val="00A10FD9"/>
     <w:rPr>
-      <w:rFonts w:ascii="Times New Roman" w:cs="Times New Roman" w:eastAsia="Times New Roman" w:hAnsi="Times New Roman"/>
-      <w:color w:themeColor="accent1" w:themeShade="BF" w:val="000000"/>
-      <w:sz w:val="28"/>
-      <w:szCs w:val="28"/>
-      <w:lang w:val="ru-RU"/>
-    </w:rPr>
-  </w:style>
-  <w:style w:customStyle="1" w:styleId="Heading4Char" w:type="character">
+      <w:rFonts w:ascii="Times New Roman" w:hAnsi="Times New Roman" w:eastAsia="Times New Roman" w:cs="Times New Roman"/>
+      <w:color w:val="000000" w:themeColor="accent1" w:themeShade="BF"/>
+      <w:sz w:val="28"/>
+      <w:szCs w:val="28"/>
+      <w:lang w:val="ru-RU"/>
+    </w:rPr>
+  </w:style>
+  <w:style w:type="character" w:styleId="Heading4Char" w:customStyle="1">
     <w:name w:val="Heading 4 Char"/>
     <w:basedOn w:val="DefaultParagraphFont"/>
     <w:link w:val="Heading4"/>
@@ -992,16 +992,16 @@
     <w:semiHidden/>
     <w:rsid w:val="00A10FD9"/>
     <w:rPr>
-      <w:rFonts w:ascii="Times New Roman" w:cs="Times New Roman" w:eastAsia="Times New Roman" w:hAnsi="Times New Roman"/>
+      <w:rFonts w:ascii="Times New Roman" w:hAnsi="Times New Roman" w:eastAsia="Times New Roman" w:cs="Times New Roman"/>
       <w:i/>
       <w:iCs/>
-      <w:color w:themeColor="accent1" w:themeShade="BF" w:val="000000"/>
-      <w:sz w:val="28"/>
-      <w:szCs w:val="28"/>
-      <w:lang w:val="ru-RU"/>
-    </w:rPr>
-  </w:style>
-  <w:style w:customStyle="1" w:styleId="Heading5Char" w:type="character">
+      <w:color w:val="000000" w:themeColor="accent1" w:themeShade="BF"/>
+      <w:sz w:val="28"/>
+      <w:szCs w:val="28"/>
+      <w:lang w:val="ru-RU"/>
+    </w:rPr>
+  </w:style>
+  <w:style w:type="character" w:styleId="Heading5Char" w:customStyle="1">
     <w:name w:val="Heading 5 Char"/>
     <w:basedOn w:val="DefaultParagraphFont"/>
     <w:link w:val="Heading5"/>
@@ -1009,11 +1009,11 @@
     <w:semiHidden/>
     <w:rsid w:val="00A10FD9"/>
     <w:rPr>
-      <w:rFonts w:cstheme="majorBidi" w:eastAsiaTheme="majorEastAsia"/>
-      <w:color w:themeColor="accent1" w:themeShade="BF" w:val="0F4761"/>
-    </w:rPr>
-  </w:style>
-  <w:style w:customStyle="1" w:styleId="Heading6Char" w:type="character">
+      <w:rFonts w:eastAsiaTheme="majorEastAsia" w:cstheme="majorBidi"/>
+      <w:color w:val="0F4761" w:themeColor="accent1" w:themeShade="BF"/>
+    </w:rPr>
+  </w:style>
+  <w:style w:type="character" w:styleId="Heading6Char" w:customStyle="1">
     <w:name w:val="Heading 6 Char"/>
     <w:basedOn w:val="DefaultParagraphFont"/>
     <w:link w:val="Heading6"/>
@@ -1021,13 +1021,13 @@
     <w:semiHidden/>
     <w:rsid w:val="00A10FD9"/>
     <w:rPr>
-      <w:rFonts w:cstheme="majorBidi" w:eastAsiaTheme="majorEastAsia"/>
+      <w:rFonts w:eastAsiaTheme="majorEastAsia" w:cstheme="majorBidi"/>
       <w:i/>
       <w:iCs/>
-      <w:color w:themeColor="text1" w:themeTint="A6" w:val="595959"/>
-    </w:rPr>
-  </w:style>
-  <w:style w:customStyle="1" w:styleId="Heading7Char" w:type="character">
+      <w:color w:val="595959" w:themeColor="text1" w:themeTint="A6"/>
+    </w:rPr>
+  </w:style>
+  <w:style w:type="character" w:styleId="Heading7Char" w:customStyle="1">
     <w:name w:val="Heading 7 Char"/>
     <w:basedOn w:val="DefaultParagraphFont"/>
     <w:link w:val="Heading7"/>
@@ -1035,11 +1035,11 @@
     <w:semiHidden/>
     <w:rsid w:val="00A10FD9"/>
     <w:rPr>
-      <w:rFonts w:cstheme="majorBidi" w:eastAsiaTheme="majorEastAsia"/>
-      <w:color w:themeColor="text1" w:themeTint="A6" w:val="595959"/>
-    </w:rPr>
-  </w:style>
-  <w:style w:customStyle="1" w:styleId="Heading8Char" w:type="character">
+      <w:rFonts w:eastAsiaTheme="majorEastAsia" w:cstheme="majorBidi"/>
+      <w:color w:val="595959" w:themeColor="text1" w:themeTint="A6"/>
+    </w:rPr>
+  </w:style>
+  <w:style w:type="character" w:styleId="Heading8Char" w:customStyle="1">
     <w:name w:val="Heading 8 Char"/>
     <w:basedOn w:val="DefaultParagraphFont"/>
     <w:link w:val="Heading8"/>
@@ -1047,13 +1047,13 @@
     <w:semiHidden/>
     <w:rsid w:val="00A10FD9"/>
     <w:rPr>
-      <w:rFonts w:cstheme="majorBidi" w:eastAsiaTheme="majorEastAsia"/>
+      <w:rFonts w:eastAsiaTheme="majorEastAsia" w:cstheme="majorBidi"/>
       <w:i/>
       <w:iCs/>
-      <w:color w:themeColor="text1" w:themeTint="D8" w:val="272727"/>
-    </w:rPr>
-  </w:style>
-  <w:style w:customStyle="1" w:styleId="Heading9Char" w:type="character">
+      <w:color w:val="272727" w:themeColor="text1" w:themeTint="D8"/>
+    </w:rPr>
+  </w:style>
+  <w:style w:type="character" w:styleId="Heading9Char" w:customStyle="1">
     <w:name w:val="Heading 9 Char"/>
     <w:basedOn w:val="DefaultParagraphFont"/>
     <w:link w:val="Heading9"/>
@@ -1061,11 +1061,11 @@
     <w:semiHidden/>
     <w:rsid w:val="00A10FD9"/>
     <w:rPr>
-      <w:rFonts w:cstheme="majorBidi" w:eastAsiaTheme="majorEastAsia"/>
-      <w:color w:themeColor="text1" w:themeTint="D8" w:val="272727"/>
-    </w:rPr>
-  </w:style>
-  <w:style w:styleId="BlockText" w:type="paragraph">
+      <w:rFonts w:eastAsiaTheme="majorEastAsia" w:cstheme="majorBidi"/>
+      <w:color w:val="272727" w:themeColor="text1" w:themeTint="D8"/>
+    </w:rPr>
+  </w:style>
+  <w:style w:type="paragraph" w:styleId="BlockText">
     <w:name w:val="Block Text"/>
     <w:basedOn w:val="BodyText"/>
     <w:next w:val="BodyText"/>
@@ -1073,8 +1073,8 @@
     <w:unhideWhenUsed/>
     <w:qFormat/>
     <w:pPr>
-      <w:spacing w:after="100" w:before="100"/>
-      <w:ind w:firstLine="0" w:left="480" w:right="480"/>
+      <w:spacing w:before="100" w:after="100"/>
+      <w:ind w:left="480" w:right="480" w:firstLine="0"/>
     </w:pPr>
     <w:rPr>
       <w:rFonts w:ascii="Times New Roman" w:hAnsi="Times New Roman"/>
@@ -1082,7 +1082,7 @@
       <w:sz w:val="24"/>
     </w:rPr>
   </w:style>
-  <w:style w:styleId="FootnoteText" w:type="paragraph">
+  <w:style w:type="paragraph" w:styleId="FootnoteText">
     <w:name w:val="Footnote Text"/>
     <w:basedOn w:val="Normal"/>
     <w:next w:val="FootnoteText"/>
@@ -1095,7 +1095,7 @@
       <w:sz w:val="24"/>
     </w:rPr>
   </w:style>
-  <w:style w:styleId="FootnoteBlockText" w:type="paragraph">
+  <w:style w:type="paragraph" w:styleId="FootnoteBlockText">
     <w:name w:val="Footnote Block Text"/>
     <w:basedOn w:val="FootnoteText"/>
     <w:next w:val="FootnoteText"/>
@@ -1103,8 +1103,8 @@
     <w:unhideWhenUsed/>
     <w:qFormat/>
     <w:pPr>
-      <w:spacing w:after="100" w:before="100"/>
-      <w:ind w:firstLine="0" w:left="480" w:right="480"/>
+      <w:spacing w:before="100" w:after="100"/>
+      <w:ind w:left="480" w:right="480" w:firstLine="0"/>
     </w:pPr>
     <w:rPr>
       <w:rFonts w:ascii="Times New Roman" w:hAnsi="Times New Roman"/>
@@ -1112,36 +1112,48 @@
       <w:sz w:val="24"/>
     </w:rPr>
   </w:style>
-  <w:style w:default="1" w:styleId="DefaultParagraphFont" w:type="character">
+  <w:style w:type="character" w:styleId="DefaultParagraphFont" w:default="1">
     <w:name w:val="Default Paragraph Font"/>
     <w:semiHidden/>
     <w:unhideWhenUsed/>
   </w:style>
-  <w:style w:default="1" w:styleId="Table" w:type="table">
+  <w:style w:type="table" w:styleId="Table" w:default="1">
     <w:name w:val="Table"/>
     <w:basedOn w:val="TableNormal"/>
     <w:semiHidden/>
     <w:unhideWhenUsed/>
     <w:qFormat/>
+    <w:rPr>
+      <w:rFonts w:ascii="Times New Roman" w:hAnsi="Times New Roman" w:eastAsia="Times New Roman" w:cs="Times New Roman"/>
+      <w:color w:val="000000"/>
+      <w:sz w:val="22"/>
+      <w:szCs w:val="22"/>
+      <w:lang w:val="ru-RU"/>
+    </w:rPr>
     <w:tblPr>
-      <w:tblInd w:type="dxa" w:w="0"/>
+      <w:tblInd w:w="0" w:type="dxa"/>
+      <w:tblBorders>
+        <w:top w:val="single" w:color="000000" w:sz="4"/>
+        <w:left w:val="single" w:color="000000" w:sz="4"/>
+        <w:bottom w:val="single" w:color="000000" w:sz="4"/>
+        <w:right w:val="single" w:color="000000" w:sz="4"/>
+        <w:insideH w:val="single" w:color="000000" w:sz="4"/>
+        <w:insideV w:val="single" w:color="000000" w:sz="4"/>
+      </w:tblBorders>
       <w:tblCellMar>
-        <w:top w:type="dxa" w:w="0"/>
-        <w:left w:type="dxa" w:w="108"/>
-        <w:bottom w:type="dxa" w:w="0"/>
-        <w:right w:type="dxa" w:w="108"/>
+        <w:top w:w="0" w:type="dxa"/>
+        <w:left w:w="108" w:type="dxa"/>
+        <w:bottom w:w="0" w:type="dxa"/>
+        <w:right w:w="108" w:type="dxa"/>
       </w:tblCellMar>
     </w:tblPr>
     <w:tblStylePr w:type="firstRow">
       <w:tcPr>
-        <w:tcBorders>
-          <w:bottom w:val="single"/>
-        </w:tcBorders>
         <w:vAlign w:val="bottom"/>
       </w:tcPr>
     </w:tblStylePr>
   </w:style>
-  <w:style w:customStyle="1" w:styleId="DefinitionTerm" w:type="paragraph">
+  <w:style w:type="paragraph" w:styleId="DefinitionTerm" w:customStyle="1">
     <w:name w:val="Definition Term"/>
     <w:basedOn w:val="Normal"/>
     <w:next w:val="Definition"/>
@@ -1157,7 +1169,7 @@
       <w:sz w:val="24"/>
     </w:rPr>
   </w:style>
-  <w:style w:customStyle="1" w:styleId="Definition" w:type="paragraph">
+  <w:style w:type="paragraph" w:styleId="Definition" w:customStyle="1">
     <w:name w:val="Definition"/>
     <w:basedOn w:val="Normal"/>
     <w:rPr>
@@ -1166,135 +1178,135 @@
       <w:sz w:val="24"/>
     </w:rPr>
   </w:style>
-  <w:style w:styleId="Caption" w:type="paragraph">
+  <w:style w:type="paragraph" w:styleId="Caption">
     <w:name w:val="Caption"/>
     <w:basedOn w:val="Normal"/>
     <w:link w:val="BodyTextChar"/>
     <w:pPr>
-      <w:keepNext w:val="0"/>
-      <w:keepLines/>
-      <w:pageBreakBefore w:val="0"/>
-      <w:widowControl/>
-      <w:spacing w:after="0" w:before="0" w:line="240" w:lineRule="auto"/>
-      <w:ind w:firstLine="0" w:left="0" w:right="0"/>
+      <w:keepNext w:val="false"/>
+      <w:keepLines w:val="true"/>
+      <w:pageBreakBefore w:val="false"/>
+      <w:widowControl w:val="true"/>
+      <w:spacing w:before="0" w:after="0" w:line="240" w:lineRule="auto"/>
+      <w:ind w:left="0" w:right="0" w:firstLine="0"/>
       <w:jc w:val="center"/>
     </w:pPr>
     <w:rPr>
-      <w:rFonts w:ascii="Times New Roman" w:cs="Times New Roman" w:eastAsia="Times New Roman" w:hAnsi="Times New Roman"/>
-      <w:b w:val="0"/>
-      <w:i w:val="0"/>
-      <w:caps w:val="0"/>
-      <w:color w:val="000000"/>
-      <w:sz w:val="28"/>
-      <w:szCs w:val="28"/>
-      <w:lang w:val="ru-RU"/>
-    </w:rPr>
-  </w:style>
-  <w:style w:customStyle="1" w:styleId="TableCaption" w:type="paragraph">
+      <w:rFonts w:ascii="Times New Roman" w:hAnsi="Times New Roman" w:eastAsia="Times New Roman" w:cs="Times New Roman"/>
+      <w:b w:val="false"/>
+      <w:i w:val="false"/>
+      <w:caps w:val="false"/>
+      <w:color w:val="000000"/>
+      <w:sz w:val="28"/>
+      <w:szCs w:val="28"/>
+      <w:lang w:val="ru-RU"/>
+    </w:rPr>
+  </w:style>
+  <w:style w:type="paragraph" w:styleId="TableCaption" w:customStyle="1">
     <w:name w:val="Table Caption"/>
     <w:basedOn w:val="Normal"/>
     <w:pPr>
-      <w:keepNext/>
-      <w:keepLines/>
-      <w:pageBreakBefore w:val="0"/>
-      <w:widowControl/>
-      <w:spacing w:after="0" w:before="0" w:line="240" w:lineRule="auto"/>
-      <w:ind w:firstLine="0" w:left="0" w:right="0"/>
+      <w:keepNext w:val="true"/>
+      <w:keepLines w:val="true"/>
+      <w:pageBreakBefore w:val="false"/>
+      <w:widowControl w:val="true"/>
+      <w:spacing w:before="0" w:after="0" w:line="240" w:lineRule="auto"/>
+      <w:ind w:left="0" w:right="0" w:firstLine="0"/>
       <w:jc w:val="left"/>
     </w:pPr>
     <w:rPr>
-      <w:rFonts w:ascii="Times New Roman" w:cs="Times New Roman" w:eastAsia="Times New Roman" w:hAnsi="Times New Roman"/>
-      <w:b w:val="0"/>
-      <w:i w:val="0"/>
-      <w:caps w:val="0"/>
-      <w:color w:val="000000"/>
-      <w:sz w:val="28"/>
-      <w:szCs w:val="28"/>
-      <w:lang w:val="ru-RU"/>
-    </w:rPr>
-  </w:style>
-  <w:style w:customStyle="1" w:styleId="ImageCaption" w:type="paragraph">
+      <w:rFonts w:ascii="Times New Roman" w:hAnsi="Times New Roman" w:eastAsia="Times New Roman" w:cs="Times New Roman"/>
+      <w:b w:val="false"/>
+      <w:i w:val="false"/>
+      <w:caps w:val="false"/>
+      <w:color w:val="000000"/>
+      <w:sz w:val="28"/>
+      <w:szCs w:val="28"/>
+      <w:lang w:val="ru-RU"/>
+    </w:rPr>
+  </w:style>
+  <w:style w:type="paragraph" w:styleId="ImageCaption" w:customStyle="1">
     <w:name w:val="Image Caption"/>
     <w:basedOn w:val="Normal"/>
     <w:pPr>
-      <w:keepNext w:val="0"/>
-      <w:keepLines/>
-      <w:pageBreakBefore w:val="0"/>
-      <w:widowControl/>
-      <w:spacing w:after="0" w:before="0" w:line="240" w:lineRule="auto"/>
-      <w:ind w:firstLine="0" w:left="0" w:right="0"/>
+      <w:keepNext w:val="false"/>
+      <w:keepLines w:val="true"/>
+      <w:pageBreakBefore w:val="false"/>
+      <w:widowControl w:val="true"/>
+      <w:spacing w:before="0" w:after="0" w:line="240" w:lineRule="auto"/>
+      <w:ind w:left="0" w:right="0" w:firstLine="0"/>
       <w:jc w:val="center"/>
     </w:pPr>
     <w:rPr>
-      <w:rFonts w:ascii="Times New Roman" w:cs="Times New Roman" w:eastAsia="Times New Roman" w:hAnsi="Times New Roman"/>
-      <w:b w:val="0"/>
-      <w:i w:val="0"/>
-      <w:caps w:val="0"/>
-      <w:color w:val="000000"/>
-      <w:sz w:val="28"/>
-      <w:szCs w:val="28"/>
-      <w:lang w:val="ru-RU"/>
-    </w:rPr>
-  </w:style>
-  <w:style w:customStyle="1" w:styleId="Figure" w:type="paragraph">
+      <w:rFonts w:ascii="Times New Roman" w:hAnsi="Times New Roman" w:eastAsia="Times New Roman" w:cs="Times New Roman"/>
+      <w:b w:val="false"/>
+      <w:i w:val="false"/>
+      <w:caps w:val="false"/>
+      <w:color w:val="000000"/>
+      <w:sz w:val="28"/>
+      <w:szCs w:val="28"/>
+      <w:lang w:val="ru-RU"/>
+    </w:rPr>
+  </w:style>
+  <w:style w:type="paragraph" w:styleId="Figure" w:customStyle="1">
     <w:name w:val="Figure"/>
     <w:basedOn w:val="Normal"/>
     <w:pPr>
-      <w:keepNext/>
-      <w:keepLines/>
-      <w:pageBreakBefore w:val="0"/>
-      <w:widowControl/>
-      <w:spacing w:after="0" w:before="0" w:line="240" w:lineRule="auto"/>
-      <w:ind w:firstLine="0" w:left="0" w:right="0"/>
+      <w:keepNext w:val="true"/>
+      <w:keepLines w:val="true"/>
+      <w:pageBreakBefore w:val="false"/>
+      <w:widowControl w:val="true"/>
+      <w:spacing w:before="0" w:after="0" w:line="240" w:lineRule="auto"/>
+      <w:ind w:left="0" w:right="0" w:firstLine="0"/>
       <w:jc w:val="center"/>
     </w:pPr>
     <w:rPr>
-      <w:rFonts w:ascii="Times New Roman" w:cs="Times New Roman" w:eastAsia="Times New Roman" w:hAnsi="Times New Roman"/>
-      <w:b w:val="0"/>
-      <w:i w:val="0"/>
-      <w:caps w:val="0"/>
-      <w:color w:val="000000"/>
-      <w:sz w:val="28"/>
-      <w:szCs w:val="28"/>
-      <w:lang w:val="ru-RU"/>
-    </w:rPr>
-  </w:style>
-  <w:style w:customStyle="1" w:styleId="CaptionedFigure" w:type="paragraph">
+      <w:rFonts w:ascii="Times New Roman" w:hAnsi="Times New Roman" w:eastAsia="Times New Roman" w:cs="Times New Roman"/>
+      <w:b w:val="false"/>
+      <w:i w:val="false"/>
+      <w:caps w:val="false"/>
+      <w:color w:val="000000"/>
+      <w:sz w:val="28"/>
+      <w:szCs w:val="28"/>
+      <w:lang w:val="ru-RU"/>
+    </w:rPr>
+  </w:style>
+  <w:style w:type="paragraph" w:styleId="CaptionedFigure" w:customStyle="1">
     <w:name w:val="Captioned Figure"/>
     <w:basedOn w:val="Normal"/>
     <w:pPr>
-      <w:keepNext/>
-      <w:keepLines/>
-      <w:pageBreakBefore w:val="0"/>
-      <w:widowControl/>
-      <w:spacing w:after="0" w:before="0" w:line="240" w:lineRule="auto"/>
-      <w:ind w:firstLine="0" w:left="0" w:right="0"/>
+      <w:keepNext w:val="true"/>
+      <w:keepLines w:val="true"/>
+      <w:pageBreakBefore w:val="false"/>
+      <w:widowControl w:val="true"/>
+      <w:spacing w:before="0" w:after="0" w:line="240" w:lineRule="auto"/>
+      <w:ind w:left="0" w:right="0" w:firstLine="0"/>
       <w:jc w:val="center"/>
     </w:pPr>
     <w:rPr>
-      <w:rFonts w:ascii="Times New Roman" w:cs="Times New Roman" w:eastAsia="Times New Roman" w:hAnsi="Times New Roman"/>
-      <w:b w:val="0"/>
-      <w:i w:val="0"/>
-      <w:caps w:val="0"/>
-      <w:color w:val="000000"/>
-      <w:sz w:val="28"/>
-      <w:szCs w:val="28"/>
-      <w:lang w:val="ru-RU"/>
-    </w:rPr>
-  </w:style>
-  <w:style w:customStyle="1" w:styleId="BodyTextChar" w:type="character">
+      <w:rFonts w:ascii="Times New Roman" w:hAnsi="Times New Roman" w:eastAsia="Times New Roman" w:cs="Times New Roman"/>
+      <w:b w:val="false"/>
+      <w:i w:val="false"/>
+      <w:caps w:val="false"/>
+      <w:color w:val="000000"/>
+      <w:sz w:val="28"/>
+      <w:szCs w:val="28"/>
+      <w:lang w:val="ru-RU"/>
+    </w:rPr>
+  </w:style>
+  <w:style w:type="character" w:styleId="BodyTextChar" w:customStyle="1">
     <w:name w:val="Body Text Char"/>
     <w:basedOn w:val="DefaultParagraphFont"/>
     <w:link w:val="BodyText"/>
     <w:rPr>
-      <w:rFonts w:ascii="Times New Roman" w:cs="Times New Roman" w:eastAsia="Times New Roman" w:hAnsi="Times New Roman"/>
-      <w:color w:val="000000"/>
-      <w:sz w:val="28"/>
-      <w:szCs w:val="28"/>
-      <w:lang w:val="ru-RU"/>
-    </w:rPr>
-  </w:style>
-  <w:style w:customStyle="1" w:styleId="VerbatimChar" w:type="character">
+      <w:rFonts w:ascii="Times New Roman" w:hAnsi="Times New Roman" w:eastAsia="Times New Roman" w:cs="Times New Roman"/>
+      <w:color w:val="000000"/>
+      <w:sz w:val="28"/>
+      <w:szCs w:val="28"/>
+      <w:lang w:val="ru-RU"/>
+    </w:rPr>
+  </w:style>
+  <w:style w:type="character" w:styleId="VerbatimChar" w:customStyle="1">
     <w:name w:val="Verbatim Char"/>
     <w:basedOn w:val="BodyTextChar"/>
     <w:rPr>
@@ -1302,25 +1314,25 @@
       <w:sz w:val="24"/>
     </w:rPr>
   </w:style>
-  <w:style w:customStyle="1" w:styleId="SectionNumber" w:type="character">
+  <w:style w:type="character" w:styleId="SectionNumber" w:customStyle="1">
     <w:name w:val="Section Number"/>
     <w:basedOn w:val="BodyTextChar"/>
   </w:style>
-  <w:style w:styleId="FootnoteReference" w:type="character">
+  <w:style w:type="character" w:styleId="FootnoteReference">
     <w:name w:val="Footnote Reference"/>
     <w:basedOn w:val="BodyTextChar"/>
     <w:rPr>
       <w:vertAlign w:val="superscript"/>
     </w:rPr>
   </w:style>
-  <w:style w:styleId="Hyperlink" w:type="character">
+  <w:style w:type="character" w:styleId="Hyperlink">
     <w:name w:val="Hyperlink"/>
     <w:basedOn w:val="BodyTextChar"/>
     <w:rPr>
-      <w:color w:themeColor="accent1" w:val="4F81BD"/>
-    </w:rPr>
-  </w:style>
-  <w:style w:styleId="TOCHeading" w:type="paragraph">
+      <w:color w:val="000000"/>
+    </w:rPr>
+  </w:style>
+  <w:style w:type="paragraph" w:styleId="TOCHeading">
     <w:name w:val="TOC Heading"/>
     <w:basedOn w:val="Normal"/>
     <w:next w:val="BodyText"/>
@@ -1328,36 +1340,36 @@
     <w:unhideWhenUsed/>
     <w:qFormat/>
     <w:pPr>
-      <w:keepNext/>
-      <w:keepLines/>
-      <w:pageBreakBefore w:val="0"/>
-      <w:widowControl/>
+      <w:keepNext w:val="true"/>
+      <w:keepLines w:val="true"/>
+      <w:pageBreakBefore w:val="false"/>
+      <w:widowControl w:val="true"/>
       <w:numPr>
         <w:numId w:val="0"/>
       </w:numPr>
-      <w:spacing w:after="280" w:before="0" w:line="240" w:lineRule="auto"/>
-      <w:ind w:firstLine="0" w:left="0" w:right="0"/>
+      <w:spacing w:before="0" w:after="280" w:line="240" w:lineRule="auto"/>
+      <w:ind w:left="0" w:right="0" w:firstLine="0"/>
       <w:jc w:val="center"/>
       <w:outlineLvl w:val="9"/>
     </w:pPr>
     <w:rPr>
-      <w:rFonts w:ascii="Times New Roman" w:cs="Times New Roman" w:eastAsia="Times New Roman" w:hAnsi="Times New Roman"/>
-      <w:b/>
+      <w:rFonts w:ascii="Times New Roman" w:hAnsi="Times New Roman" w:eastAsia="Times New Roman" w:cs="Times New Roman"/>
+      <w:b w:val="true"/>
       <w:bCs w:val="0"/>
-      <w:i w:val="0"/>
-      <w:caps/>
-      <w:color w:val="000000"/>
-      <w:sz w:val="28"/>
-      <w:szCs w:val="28"/>
-      <w:lang w:val="ru-RU"/>
-    </w:rPr>
-  </w:style>
-  <w:style w:customStyle="1" w:styleId="Institution" w:type="paragraph">
+      <w:i w:val="false"/>
+      <w:caps w:val="true"/>
+      <w:color w:val="000000"/>
+      <w:sz w:val="28"/>
+      <w:szCs w:val="28"/>
+      <w:lang w:val="ru-RU"/>
+    </w:rPr>
+  </w:style>
+  <w:style w:type="paragraph" w:styleId="Institution" w:customStyle="1">
     <w:name w:val="Institution"/>
     <w:basedOn w:val="Normal"/>
     <w:pPr>
       <w:keepNext w:val="0"/>
-      <w:spacing w:after="80" w:before="0" w:line="240" w:lineRule="auto"/>
+      <w:spacing w:before="0" w:after="80" w:line="240" w:lineRule="auto"/>
       <w:ind w:firstLine="0"/>
       <w:jc w:val="center"/>
     </w:pPr>
@@ -1368,12 +1380,12 @@
       <w:sz w:val="24"/>
     </w:rPr>
   </w:style>
-  <w:style w:customStyle="1" w:styleId="WorkType" w:type="paragraph">
+  <w:style w:type="paragraph" w:styleId="WorkType" w:customStyle="1">
     <w:name w:val="WorkType"/>
     <w:basedOn w:val="Normal"/>
     <w:pPr>
       <w:keepNext w:val="0"/>
-      <w:spacing w:after="240" w:before="1800" w:line="240" w:lineRule="auto"/>
+      <w:spacing w:before="1800" w:after="240" w:line="240" w:lineRule="auto"/>
       <w:ind w:firstLine="0"/>
       <w:jc w:val="center"/>
     </w:pPr>
@@ -1384,12 +1396,12 @@
       <w:sz w:val="28"/>
     </w:rPr>
   </w:style>
-  <w:style w:customStyle="1" w:styleId="TitleDetails" w:type="paragraph">
+  <w:style w:type="paragraph" w:styleId="TitleDetails" w:customStyle="1">
     <w:name w:val="TitleDetails"/>
     <w:basedOn w:val="Normal"/>
     <w:pPr>
       <w:keepNext w:val="0"/>
-      <w:spacing w:after="700" w:before="0" w:line="240" w:lineRule="auto"/>
+      <w:spacing w:before="0" w:after="700" w:line="240" w:lineRule="auto"/>
       <w:ind w:firstLine="0"/>
       <w:jc w:val="center"/>
     </w:pPr>
@@ -1400,12 +1412,12 @@
       <w:sz w:val="24"/>
     </w:rPr>
   </w:style>
-  <w:style w:customStyle="1" w:styleId="StudentDetails" w:type="paragraph">
+  <w:style w:type="paragraph" w:styleId="StudentDetails" w:customStyle="1">
     <w:name w:val="StudentDetails"/>
     <w:basedOn w:val="Normal"/>
     <w:pPr>
       <w:keepNext w:val="0"/>
-      <w:spacing w:after="120" w:before="0" w:line="240" w:lineRule="auto"/>
+      <w:spacing w:before="0" w:after="120" w:line="240" w:lineRule="auto"/>
       <w:ind w:firstLine="0"/>
       <w:jc w:val="right"/>
     </w:pPr>
@@ -1416,12 +1428,12 @@
       <w:sz w:val="24"/>
     </w:rPr>
   </w:style>
-  <w:style w:customStyle="1" w:styleId="TitlePlace" w:type="paragraph">
+  <w:style w:type="paragraph" w:styleId="TitlePlace" w:customStyle="1">
     <w:name w:val="TitlePlace"/>
     <w:basedOn w:val="Normal"/>
     <w:pPr>
       <w:keepNext w:val="0"/>
-      <w:spacing w:after="0" w:before="1800" w:line="240" w:lineRule="auto"/>
+      <w:spacing w:before="1800" w:after="0" w:line="240" w:lineRule="auto"/>
       <w:ind w:firstLine="0"/>
       <w:jc w:val="center"/>
     </w:pPr>
@@ -1432,12 +1444,12 @@
       <w:sz w:val="24"/>
     </w:rPr>
   </w:style>
-  <w:style w:customStyle="1" w:styleId="FrontMatterHeading" w:type="paragraph">
+  <w:style w:type="paragraph" w:styleId="FrontMatterHeading" w:customStyle="1">
     <w:name w:val="FrontMatterHeading"/>
     <w:basedOn w:val="Normal"/>
     <w:pPr>
       <w:keepNext w:val="0"/>
-      <w:spacing w:after="240" w:before="0" w:line="240" w:lineRule="auto"/>
+      <w:spacing w:before="0" w:after="240" w:line="240" w:lineRule="auto"/>
       <w:ind w:firstLine="0"/>
       <w:jc w:val="center"/>
     </w:pPr>
@@ -1448,45 +1460,45 @@
       <w:sz w:val="28"/>
     </w:rPr>
   </w:style>
-  <w:style w:customStyle="1" w:styleId="UnnumberedHeading" w:type="paragraph">
+  <w:style w:type="paragraph" w:styleId="UnnumberedHeading" w:customStyle="1">
     <w:name w:val="Unnumbered Heading"/>
     <w:basedOn w:val="Normal"/>
     <w:next w:val="BodyText"/>
     <w:pPr>
-      <w:keepNext/>
-      <w:keepLines/>
-      <w:pageBreakBefore/>
-      <w:widowControl/>
-      <w:suppressAutoHyphens w:val="1"/>
-      <w:spacing w:after="280" w:before="0" w:line="240" w:lineRule="auto"/>
-      <w:ind w:firstLine="0" w:left="0" w:right="0"/>
+      <w:keepNext w:val="true"/>
+      <w:keepLines w:val="true"/>
+      <w:pageBreakBefore w:val="true"/>
+      <w:widowControl w:val="true"/>
+      <w:suppressAutoHyphens w:val="true"/>
+      <w:spacing w:before="0" w:after="280" w:line="240" w:lineRule="auto"/>
+      <w:ind w:left="0" w:right="0" w:firstLine="0"/>
       <w:jc w:val="center"/>
       <w:outlineLvl w:val="0"/>
     </w:pPr>
     <w:rPr>
-      <w:rFonts w:ascii="Times New Roman" w:cs="Times New Roman" w:eastAsia="Times New Roman" w:hAnsi="Times New Roman"/>
-      <w:b/>
-      <w:i w:val="0"/>
-      <w:caps/>
-      <w:color w:val="000000"/>
-      <w:sz w:val="28"/>
-      <w:szCs w:val="28"/>
-      <w:lang w:val="ru-RU"/>
-    </w:rPr>
-  </w:style>
-  <w:style w:customStyle="1" w:styleId="SourceCode" w:type="paragraph">
+      <w:rFonts w:ascii="Times New Roman" w:hAnsi="Times New Roman" w:eastAsia="Times New Roman" w:cs="Times New Roman"/>
+      <w:b w:val="true"/>
+      <w:i w:val="false"/>
+      <w:caps w:val="true"/>
+      <w:color w:val="000000"/>
+      <w:sz w:val="28"/>
+      <w:szCs w:val="28"/>
+      <w:lang w:val="ru-RU"/>
+    </w:rPr>
+  </w:style>
+  <w:style w:type="paragraph" w:styleId="SourceCode" w:customStyle="1">
     <w:name w:val="Source Code"/>
     <w:basedOn w:val="Normal"/>
     <w:link w:val="VerbatimChar"/>
     <w:pPr>
       <w:keepNext w:val="0"/>
       <w:keepLines w:val="0"/>
-      <w:spacing w:line="240" w:lineRule="auto" w:before="0" w:after="120"/>
+      <w:spacing w:before="0" w:after="120" w:line="240" w:lineRule="auto"/>
       <w:ind w:left="0" w:right="0" w:firstLine="0"/>
       <w:jc w:val="left"/>
     </w:pPr>
   </w:style>
-  <w:style w:customStyle="1" w:styleId="KeywordTok" w:type="character">
+  <w:style w:type="character" w:styleId="KeywordTok" w:customStyle="1">
     <w:name w:val="KeywordTok"/>
     <w:basedOn w:val="VerbatimChar"/>
     <w:rPr>
@@ -1495,77 +1507,77 @@
       <w:color w:val="000000"/>
     </w:rPr>
   </w:style>
-  <w:style w:customStyle="1" w:styleId="DataTypeTok" w:type="character">
+  <w:style w:type="character" w:styleId="DataTypeTok" w:customStyle="1">
     <w:name w:val="DataTypeTok"/>
     <w:basedOn w:val="VerbatimChar"/>
     <w:rPr>
       <w:color w:val="000000"/>
     </w:rPr>
   </w:style>
-  <w:style w:customStyle="1" w:styleId="DecValTok" w:type="character">
+  <w:style w:type="character" w:styleId="DecValTok" w:customStyle="1">
     <w:name w:val="DecValTok"/>
     <w:basedOn w:val="VerbatimChar"/>
     <w:rPr>
       <w:color w:val="000000"/>
     </w:rPr>
   </w:style>
-  <w:style w:customStyle="1" w:styleId="BaseNTok" w:type="character">
+  <w:style w:type="character" w:styleId="BaseNTok" w:customStyle="1">
     <w:name w:val="BaseNTok"/>
     <w:basedOn w:val="VerbatimChar"/>
     <w:rPr>
       <w:color w:val="000000"/>
     </w:rPr>
   </w:style>
-  <w:style w:customStyle="1" w:styleId="FloatTok" w:type="character">
+  <w:style w:type="character" w:styleId="FloatTok" w:customStyle="1">
     <w:name w:val="FloatTok"/>
     <w:basedOn w:val="VerbatimChar"/>
     <w:rPr>
       <w:color w:val="000000"/>
     </w:rPr>
   </w:style>
-  <w:style w:customStyle="1" w:styleId="ConstantTok" w:type="character">
+  <w:style w:type="character" w:styleId="ConstantTok" w:customStyle="1">
     <w:name w:val="ConstantTok"/>
     <w:basedOn w:val="VerbatimChar"/>
     <w:rPr>
       <w:color w:val="000000"/>
     </w:rPr>
   </w:style>
-  <w:style w:customStyle="1" w:styleId="CharTok" w:type="character">
+  <w:style w:type="character" w:styleId="CharTok" w:customStyle="1">
     <w:name w:val="CharTok"/>
     <w:basedOn w:val="VerbatimChar"/>
     <w:rPr>
       <w:color w:val="000000"/>
     </w:rPr>
   </w:style>
-  <w:style w:customStyle="1" w:styleId="SpecialCharTok" w:type="character">
+  <w:style w:type="character" w:styleId="SpecialCharTok" w:customStyle="1">
     <w:name w:val="SpecialCharTok"/>
     <w:basedOn w:val="VerbatimChar"/>
     <w:rPr>
       <w:color w:val="000000"/>
     </w:rPr>
   </w:style>
-  <w:style w:customStyle="1" w:styleId="StringTok" w:type="character">
+  <w:style w:type="character" w:styleId="StringTok" w:customStyle="1">
     <w:name w:val="StringTok"/>
     <w:basedOn w:val="VerbatimChar"/>
     <w:rPr>
       <w:color w:val="000000"/>
     </w:rPr>
   </w:style>
-  <w:style w:customStyle="1" w:styleId="VerbatimStringTok" w:type="character">
+  <w:style w:type="character" w:styleId="VerbatimStringTok" w:customStyle="1">
     <w:name w:val="VerbatimStringTok"/>
     <w:basedOn w:val="VerbatimChar"/>
     <w:rPr>
       <w:color w:val="000000"/>
     </w:rPr>
   </w:style>
-  <w:style w:customStyle="1" w:styleId="SpecialStringTok" w:type="character">
+  <w:style w:type="character" w:styleId="SpecialStringTok" w:customStyle="1">
     <w:name w:val="SpecialStringTok"/>
     <w:basedOn w:val="VerbatimChar"/>
     <w:rPr>
       <w:color w:val="000000"/>
     </w:rPr>
   </w:style>
-  <w:style w:customStyle="1" w:styleId="ImportTok" w:type="character">
+  <w:style w:type="character" w:styleId="ImportTok" w:customStyle="1">
     <w:name w:val="ImportTok"/>
     <w:basedOn w:val="VerbatimChar"/>
     <w:rPr>
@@ -1574,7 +1586,7 @@
       <w:color w:val="000000"/>
     </w:rPr>
   </w:style>
-  <w:style w:customStyle="1" w:styleId="CommentTok" w:type="character">
+  <w:style w:type="character" w:styleId="CommentTok" w:customStyle="1">
     <w:name w:val="CommentTok"/>
     <w:basedOn w:val="VerbatimChar"/>
     <w:rPr>
@@ -1582,7 +1594,7 @@
       <w:color w:val="000000"/>
     </w:rPr>
   </w:style>
-  <w:style w:customStyle="1" w:styleId="DocumentationTok" w:type="character">
+  <w:style w:type="character" w:styleId="DocumentationTok" w:customStyle="1">
     <w:name w:val="DocumentationTok"/>
     <w:basedOn w:val="VerbatimChar"/>
     <w:rPr>
@@ -1590,7 +1602,7 @@
       <w:color w:val="000000"/>
     </w:rPr>
   </w:style>
-  <w:style w:customStyle="1" w:styleId="AnnotationTok" w:type="character">
+  <w:style w:type="character" w:styleId="AnnotationTok" w:customStyle="1">
     <w:name w:val="AnnotationTok"/>
     <w:basedOn w:val="VerbatimChar"/>
     <w:rPr>
@@ -1599,7 +1611,7 @@
       <w:color w:val="000000"/>
     </w:rPr>
   </w:style>
-  <w:style w:customStyle="1" w:styleId="CommentVarTok" w:type="character">
+  <w:style w:type="character" w:styleId="CommentVarTok" w:customStyle="1">
     <w:name w:val="CommentVarTok"/>
     <w:basedOn w:val="VerbatimChar"/>
     <w:rPr>
@@ -1608,28 +1620,28 @@
       <w:color w:val="000000"/>
     </w:rPr>
   </w:style>
-  <w:style w:customStyle="1" w:styleId="OtherTok" w:type="character">
+  <w:style w:type="character" w:styleId="OtherTok" w:customStyle="1">
     <w:name w:val="OtherTok"/>
     <w:basedOn w:val="VerbatimChar"/>
     <w:rPr>
       <w:color w:val="000000"/>
     </w:rPr>
   </w:style>
-  <w:style w:customStyle="1" w:styleId="FunctionTok" w:type="character">
+  <w:style w:type="character" w:styleId="FunctionTok" w:customStyle="1">
     <w:name w:val="FunctionTok"/>
     <w:basedOn w:val="VerbatimChar"/>
     <w:rPr>
       <w:color w:val="000000"/>
     </w:rPr>
   </w:style>
-  <w:style w:customStyle="1" w:styleId="VariableTok" w:type="character">
+  <w:style w:type="character" w:styleId="VariableTok" w:customStyle="1">
     <w:name w:val="VariableTok"/>
     <w:basedOn w:val="VerbatimChar"/>
     <w:rPr>
       <w:color w:val="000000"/>
     </w:rPr>
   </w:style>
-  <w:style w:customStyle="1" w:styleId="ControlFlowTok" w:type="character">
+  <w:style w:type="character" w:styleId="ControlFlowTok" w:customStyle="1">
     <w:name w:val="ControlFlowTok"/>
     <w:basedOn w:val="VerbatimChar"/>
     <w:rPr>
@@ -1638,49 +1650,49 @@
       <w:color w:val="000000"/>
     </w:rPr>
   </w:style>
-  <w:style w:customStyle="1" w:styleId="OperatorTok" w:type="character">
+  <w:style w:type="character" w:styleId="OperatorTok" w:customStyle="1">
     <w:name w:val="OperatorTok"/>
     <w:basedOn w:val="VerbatimChar"/>
     <w:rPr>
       <w:color w:val="000000"/>
     </w:rPr>
   </w:style>
-  <w:style w:customStyle="1" w:styleId="BuiltInTok" w:type="character">
+  <w:style w:type="character" w:styleId="BuiltInTok" w:customStyle="1">
     <w:name w:val="BuiltInTok"/>
     <w:basedOn w:val="VerbatimChar"/>
     <w:rPr>
       <w:color w:val="000000"/>
     </w:rPr>
   </w:style>
-  <w:style w:customStyle="1" w:styleId="ExtensionTok" w:type="character">
+  <w:style w:type="character" w:styleId="ExtensionTok" w:customStyle="1">
     <w:name w:val="ExtensionTok"/>
     <w:basedOn w:val="VerbatimChar"/>
     <w:rPr>
       <w:color w:val="000000"/>
     </w:rPr>
   </w:style>
-  <w:style w:customStyle="1" w:styleId="PreprocessorTok" w:type="character">
+  <w:style w:type="character" w:styleId="PreprocessorTok" w:customStyle="1">
     <w:name w:val="PreprocessorTok"/>
     <w:basedOn w:val="VerbatimChar"/>
     <w:rPr>
       <w:color w:val="000000"/>
     </w:rPr>
   </w:style>
-  <w:style w:customStyle="1" w:styleId="AttributeTok" w:type="character">
+  <w:style w:type="character" w:styleId="AttributeTok" w:customStyle="1">
     <w:name w:val="AttributeTok"/>
     <w:basedOn w:val="VerbatimChar"/>
     <w:rPr>
       <w:color w:val="000000"/>
     </w:rPr>
   </w:style>
-  <w:style w:customStyle="1" w:styleId="RegionMarkerTok" w:type="character">
+  <w:style w:type="character" w:styleId="RegionMarkerTok" w:customStyle="1">
     <w:name w:val="RegionMarkerTok"/>
     <w:basedOn w:val="VerbatimChar"/>
     <w:rPr>
       <w:color w:val="000000"/>
     </w:rPr>
   </w:style>
-  <w:style w:customStyle="1" w:styleId="InformationTok" w:type="character">
+  <w:style w:type="character" w:styleId="InformationTok" w:customStyle="1">
     <w:name w:val="InformationTok"/>
     <w:basedOn w:val="VerbatimChar"/>
     <w:rPr>
@@ -1689,7 +1701,7 @@
       <w:color w:val="000000"/>
     </w:rPr>
   </w:style>
-  <w:style w:customStyle="1" w:styleId="WarningTok" w:type="character">
+  <w:style w:type="character" w:styleId="WarningTok" w:customStyle="1">
     <w:name w:val="WarningTok"/>
     <w:basedOn w:val="VerbatimChar"/>
     <w:rPr>
@@ -1698,7 +1710,7 @@
       <w:color w:val="000000"/>
     </w:rPr>
   </w:style>
-  <w:style w:customStyle="1" w:styleId="AlertTok" w:type="character">
+  <w:style w:type="character" w:styleId="AlertTok" w:customStyle="1">
     <w:name w:val="AlertTok"/>
     <w:basedOn w:val="VerbatimChar"/>
     <w:rPr>
@@ -1706,7 +1718,7 @@
       <w:color w:val="000000"/>
     </w:rPr>
   </w:style>
-  <w:style w:customStyle="1" w:styleId="ErrorTok" w:type="character">
+  <w:style w:type="character" w:styleId="ErrorTok" w:customStyle="1">
     <w:name w:val="ErrorTok"/>
     <w:basedOn w:val="VerbatimChar"/>
     <w:rPr>
@@ -1714,57 +1726,63 @@
       <w:color w:val="000000"/>
     </w:rPr>
   </w:style>
-  <w:style w:customStyle="1" w:styleId="NormalTok" w:type="character">
+  <w:style w:type="character" w:styleId="NormalTok" w:customStyle="1">
     <w:name w:val="NormalTok"/>
     <w:basedOn w:val="VerbatimChar"/>
     <w:rPr>
       <w:color w:val="000000"/>
     </w:rPr>
   </w:style>
-  <w:style w:customStyle="1" w:styleId="Formula" w:type="paragraph">
+  <w:style w:type="paragraph" w:styleId="Formula" w:customStyle="1">
     <w:name w:val="Formula"/>
     <w:basedOn w:val="Normal"/>
     <w:pPr>
-      <w:keepNext w:val="0"/>
-      <w:keepLines/>
-      <w:pageBreakBefore w:val="0"/>
-      <w:widowControl/>
-      <w:spacing w:after="340" w:before="340" w:line="240" w:lineRule="auto"/>
-      <w:ind w:firstLine="0" w:left="0" w:right="0"/>
+      <w:keepNext w:val="false"/>
+      <w:keepLines w:val="true"/>
+      <w:pageBreakBefore w:val="false"/>
+      <w:widowControl w:val="true"/>
+      <w:spacing w:before="340" w:after="340" w:line="240" w:lineRule="auto"/>
+      <w:ind w:left="0" w:right="0" w:firstLine="0"/>
+      <w:jc w:val="center"/>
+    </w:pPr>
+    <w:rPr>
+      <w:rFonts w:ascii="Times New Roman" w:hAnsi="Times New Roman" w:eastAsia="Times New Roman" w:cs="Times New Roman"/>
+      <w:b w:val="false"/>
+      <w:i w:val="false"/>
+      <w:caps w:val="false"/>
+      <w:color w:val="000000"/>
+      <w:sz w:val="28"/>
+      <w:szCs w:val="28"/>
+      <w:lang w:val="ru-RU"/>
+    </w:rPr>
+  </w:style>
+  <w:style w:type="paragraph" w:styleId="FormulaDefinitions" w:customStyle="1">
+    <w:name w:val="Formula Definitions"/>
+    <w:basedOn w:val="Normal"/>
+    <w:pPr>
+      <w:keepNext w:val="false"/>
+      <w:keepLines w:val="true"/>
+      <w:pageBreakBefore w:val="false"/>
+      <w:widowControl w:val="true"/>
+      <w:spacing w:before="0" w:after="0" w:line="240" w:lineRule="auto"/>
+      <w:ind w:left="0" w:right="0" w:firstLine="0"/>
       <w:jc w:val="left"/>
     </w:pPr>
     <w:rPr>
-      <w:rFonts w:ascii="Times New Roman" w:cs="Times New Roman" w:eastAsia="Times New Roman" w:hAnsi="Times New Roman"/>
-      <w:b w:val="0"/>
-      <w:i w:val="0"/>
-      <w:caps w:val="0"/>
-      <w:color w:val="000000"/>
-      <w:sz w:val="28"/>
-      <w:szCs w:val="28"/>
-      <w:lang w:val="ru-RU"/>
-    </w:rPr>
-  </w:style>
-  <w:style w:customStyle="1" w:styleId="FormulaDefinitions" w:type="paragraph">
-    <w:name w:val="Formula Definitions"/>
-    <w:basedOn w:val="Normal"/>
-    <w:pPr>
-      <w:keepNext w:val="0"/>
-      <w:keepLines/>
-      <w:pageBreakBefore w:val="0"/>
-      <w:widowControl/>
-      <w:spacing w:after="0" w:before="0" w:line="240" w:lineRule="auto"/>
-      <w:ind w:firstLine="0" w:left="0" w:right="0"/>
-      <w:jc w:val="left"/>
-    </w:pPr>
-    <w:rPr>
-      <w:rFonts w:ascii="Times New Roman" w:cs="Times New Roman" w:eastAsia="Times New Roman" w:hAnsi="Times New Roman"/>
-      <w:b w:val="0"/>
-      <w:i w:val="0"/>
-      <w:caps w:val="0"/>
-      <w:color w:val="000000"/>
-      <w:sz w:val="28"/>
-      <w:szCs w:val="28"/>
-      <w:lang w:val="ru-RU"/>
+      <w:rFonts w:ascii="Times New Roman" w:hAnsi="Times New Roman" w:eastAsia="Times New Roman" w:cs="Times New Roman"/>
+      <w:b w:val="false"/>
+      <w:i w:val="false"/>
+      <w:caps w:val="false"/>
+      <w:color w:val="000000"/>
+      <w:sz w:val="28"/>
+      <w:szCs w:val="28"/>
+      <w:lang w:val="ru-RU"/>
+    </w:rPr>
+  </w:style>
+  <w:style w:type="character" w:styleId="FollowedHyperlink">
+    <w:name w:val="FollowedHyperlink"/>
+    <w:rPr>
+      <w:color w:val="000000"/>
     </w:rPr>
   </w:style>
 </w:styles>

</xml_diff>